<commit_message>
Adicionada tela de logn [PRIMEIRA VERSÃO E PRODUÇÃO]
</commit_message>
<xml_diff>
--- a/Modelos/PETIÇÃO - JULGAMENTO ANTECIPADO DO MÉRITO - PASEP.docx
+++ b/Modelos/PETIÇÃO - JULGAMENTO ANTECIPADO DO MÉRITO - PASEP.docx
@@ -4,20 +4,27 @@
   <w:body>
     <w:p>
       <w:pPr>
-        <w:shd w:val="clear" w:color="auto" w:fill="FFFF00"/>
-        <w:ind w:firstLine="0"/>
-      </w:pPr>
-      <w:r>
+        <w:ind w:firstLine="0"/>
         <w:rPr>
           <w:b/>
           <w:bCs/>
         </w:rPr>
-        <w:t>EXCELENTÍSSIMO(A) SENHOR(A) DOUTOR(A) JUIZ(A) DE DIREITO DA ___ VARA CÍVEL DA COMARCA DE ____</w:t>
-      </w:r>
-    </w:p>
-    <w:p>
-      <w:pPr>
-        <w:ind w:firstLine="0"/>
+      </w:pPr>
+      <w:r>
+        <w:rPr>
+          <w:b/>
+          <w:bCs/>
+        </w:rPr>
+        <w:t>AO JUÍZO</w:t>
+      </w:r>
+    </w:p>
+    <w:p>
+      <w:pPr>
+        <w:ind w:firstLine="0"/>
+        <w:rPr>
+          <w:b/>
+          <w:bCs/>
+        </w:rPr>
       </w:pPr>
     </w:p>
     <w:p>
@@ -41,8 +48,22 @@
           <w:i/>
           <w:iCs/>
         </w:rPr>
+        <w:t>{{ numero_processo }}</w:t>
+      </w:r>
+      <w:r>
+        <w:rPr>
+          <w:i/>
+          <w:iCs/>
+        </w:rPr>
         <w:br/>
         <w:t xml:space="preserve">Autor: </w:t>
+      </w:r>
+      <w:r>
+        <w:rPr>
+          <w:i/>
+          <w:iCs/>
+        </w:rPr>
+        <w:t xml:space="preserve"> {{ nome_autor }}</w:t>
       </w:r>
       <w:r>
         <w:rPr>
@@ -85,35 +106,37 @@
         <w:t>BANCO DO BRASIL S.A.</w:t>
       </w:r>
       <w:r>
-        <w:t xml:space="preserve">, já qualificado nos autos, por seus advogados, vem, respeitosamente, à presença de Vossa Excelência, com fundamento nos </w:t>
-      </w:r>
-      <w:proofErr w:type="spellStart"/>
-      <w:r>
-        <w:t>arts</w:t>
-      </w:r>
-      <w:proofErr w:type="spellEnd"/>
-      <w:r>
-        <w:t>. 355, I, 487, II, 189 e 205 do Código Civil, bem como no art. 927, III, do CPC, requerer o JULGAMENTO ANTECIPADO DO MÉRITO, pelas razões a seguir expostas.</w:t>
-      </w:r>
-    </w:p>
-    <w:p>
-      <w:pPr>
-        <w:ind w:firstLine="0"/>
-      </w:pPr>
-    </w:p>
-    <w:p>
-      <w:pPr>
-        <w:ind w:firstLine="0"/>
+        <w:t xml:space="preserve">, já qualificado nos autos, por seus advogados, vem, respeitosamente, à presença de Vossa Excelência, com fundamento nos arts. 355, I, 487, II, 189 e 205 do Código Civil, bem como no art. 927, III, do CPC, requerer o </w:t>
+      </w:r>
+      <w:r>
         <w:rPr>
           <w:b/>
           <w:bCs/>
         </w:rPr>
-      </w:pPr>
-      <w:r>
+        <w:t>JULGAMENTO ANTECIPADO DO MÉRITO</w:t>
+      </w:r>
+      <w:r>
+        <w:t>, pelas razões a seguir expostas.</w:t>
+      </w:r>
+    </w:p>
+    <w:p>
+      <w:pPr>
+        <w:ind w:firstLine="0"/>
+      </w:pPr>
+    </w:p>
+    <w:p>
+      <w:pPr>
+        <w:ind w:firstLine="0"/>
         <w:rPr>
           <w:b/>
           <w:bCs/>
         </w:rPr>
+      </w:pPr>
+      <w:r>
+        <w:rPr>
+          <w:b/>
+          <w:bCs/>
+        </w:rPr>
         <w:t>I – DA DESNECESSIDADE DE DILAÇÃO PROBATÓRIA</w:t>
       </w:r>
     </w:p>
@@ -123,8 +146,6 @@
       </w:pPr>
       <w:r>
         <w:tab/>
-      </w:r>
-      <w:r>
         <w:t>A controvérsia posta nos autos é exclusivamente de direito, cingindo-se à definição do termo inicial do prazo prescricional da pretensão deduzida pela parte autora, inexistindo qualquer fato controvertido que demande produção de prova oral ou pericial.</w:t>
       </w:r>
     </w:p>
@@ -191,40 +212,20 @@
       </w:pPr>
       <w:r>
         <w:tab/>
-      </w:r>
-      <w:r>
         <w:t xml:space="preserve">O entendimento é vinculante, nos termos do art. 927, III, do CPC, e afasta definitivamente a aplicação ampliada da teoria da </w:t>
       </w:r>
-      <w:proofErr w:type="spellStart"/>
       <w:r>
         <w:rPr>
           <w:i/>
           <w:iCs/>
         </w:rPr>
-        <w:t>actio</w:t>
-      </w:r>
-      <w:proofErr w:type="spellEnd"/>
-      <w:r>
-        <w:rPr>
-          <w:i/>
-          <w:iCs/>
-        </w:rPr>
-        <w:t xml:space="preserve"> nata</w:t>
-      </w:r>
-      <w:r>
-        <w:t xml:space="preserve"> subjetiva após o saque integral.</w:t>
-      </w:r>
-      <w:r>
-        <w:t xml:space="preserve"> </w:t>
-      </w:r>
-      <w:r>
-        <w:t xml:space="preserve">No caso concreto, o saque integral </w:t>
-      </w:r>
-      <w:r>
-        <w:rPr>
-          <w:shd w:val="clear" w:color="auto" w:fill="FFFF00"/>
-        </w:rPr>
-        <w:t>ocorreu em ____,</w:t>
+        <w:t>actio nata</w:t>
+      </w:r>
+      <w:r>
+        <w:t xml:space="preserve"> subjetiva após o saque integral. No caso concreto, o saque integral</w:t>
+      </w:r>
+      <w:r>
+        <w:t xml:space="preserve"> ocorreu em {{ data_prescricao }}</w:t>
       </w:r>
       <w:r>
         <w:t xml:space="preserve"> marco a partir do qual o titular teve ciência inequívoca do valor reputado devido pelo Banco, iniciando-se, desde então, o prazo prescricional decenal do art. 205 do Código Civil.</w:t>
@@ -246,143 +247,127 @@
         </w:rPr>
         <w:lastRenderedPageBreak/>
         <w:tab/>
+        <w:t>A presente ação, contudo,</w:t>
       </w:r>
       <w:r>
         <w:rPr>
           <w:b/>
           <w:bCs/>
         </w:rPr>
-        <w:t xml:space="preserve">A presente ação, contudo, </w:t>
-      </w:r>
-      <w:r>
+        <w:t xml:space="preserve"> somente foi ajuizada em {{ data_ajuizamento }} </w:t>
+      </w:r>
+      <w:r>
+        <w:rPr>
+          <w:b/>
+          <w:bCs/>
+        </w:rPr>
+        <w:t>quando já ultrapassado o prazo prescricional, impondo-se o reconhecimento da prescrição da pretensão.</w:t>
+      </w:r>
+    </w:p>
+    <w:p>
+      <w:pPr>
+        <w:ind w:firstLine="0"/>
+        <w:jc w:val="center"/>
+      </w:pPr>
+    </w:p>
+    <w:p>
+      <w:pPr>
+        <w:ind w:firstLine="0"/>
+        <w:jc w:val="center"/>
+      </w:pPr>
+      <w:r>
+        <w:t>{{ comprovante_prescricao }}</w:t>
+      </w:r>
+    </w:p>
+    <w:p>
+      <w:pPr>
+        <w:ind w:firstLine="0"/>
+        <w:jc w:val="center"/>
+      </w:pPr>
+    </w:p>
+    <w:p>
+      <w:pPr>
+        <w:ind w:firstLine="0"/>
+        <w:rPr>
+          <w:b/>
+          <w:bCs/>
+        </w:rPr>
+      </w:pPr>
+      <w:r>
+        <w:rPr>
+          <w:b/>
+          <w:bCs/>
+        </w:rPr>
+        <w:t>III – CONSEQUÊNCIA JURÍDICA NECESSÁRIA</w:t>
+      </w:r>
+    </w:p>
+    <w:p>
+      <w:pPr>
+        <w:ind w:firstLine="0"/>
+      </w:pPr>
+      <w:r>
+        <w:tab/>
+      </w:r>
+      <w:r>
+        <w:t>Diante da orientação obrigatória do STJ, a manutenção do feito representaria violação direta aos arts. 927, III, e 489, §1º, VI, do CPC, além de afronta à segurança jurídica e à isonomia.</w:t>
+      </w:r>
+    </w:p>
+    <w:p>
+      <w:pPr>
+        <w:ind w:firstLine="0"/>
+        <w:rPr>
+          <w:b/>
+          <w:bCs/>
+        </w:rPr>
+      </w:pPr>
+      <w:r>
+        <w:rPr>
+          <w:b/>
+          <w:bCs/>
+        </w:rPr>
+        <w:t xml:space="preserve">IV – </w:t>
+      </w:r>
+      <w:r>
+        <w:rPr>
+          <w:b/>
+          <w:bCs/>
+        </w:rPr>
+        <w:t>DOS HONORÁRIOS ADVOCATÍCIOS DE SUCUMBÊNCIA</w:t>
+      </w:r>
+    </w:p>
+    <w:p>
+      <w:r>
+        <w:t xml:space="preserve">Reconhecida a prescrição da pretensão autoral, com a consequente extinção do processo com resolução </w:t>
+      </w:r>
+      <w:r>
+        <w:rPr>
+          <w:u w:val="single"/>
+        </w:rPr>
+        <w:t>do</w:t>
+      </w:r>
+      <w:r>
+        <w:t xml:space="preserve"> mérito, impõe-se a condenação da parte autora ao pagamento de honorários advocatícios sucumbenciais, nos termos do art. 85, caput e §2º, do Código de Processo Civil.</w:t>
+      </w:r>
+      <w:r>
+        <w:t xml:space="preserve"> </w:t>
+      </w:r>
+    </w:p>
+    <w:p>
+      <w:pPr>
         <w:rPr>
           <w:b/>
           <w:bCs/>
           <w:shd w:val="clear" w:color="auto" w:fill="FFFF00"/>
         </w:rPr>
-        <w:t>somente foi ajuizada em ____,</w:t>
-      </w:r>
+      </w:pPr>
       <w:r>
         <w:rPr>
           <w:b/>
           <w:bCs/>
         </w:rPr>
-        <w:t xml:space="preserve"> quando já ultrapassado o prazo prescricional, impondo-se o reconhecimento da prescrição da pretensão.</w:t>
-      </w:r>
-    </w:p>
-    <w:p>
-      <w:pPr>
-        <w:ind w:firstLine="0"/>
-      </w:pPr>
-    </w:p>
-    <w:p>
-      <w:pPr>
-        <w:shd w:val="clear" w:color="auto" w:fill="FFFF00"/>
-        <w:ind w:firstLine="0"/>
-        <w:jc w:val="center"/>
-      </w:pPr>
-      <w:r>
-        <w:t>Inserir comprovante do saque</w:t>
-      </w:r>
-    </w:p>
-    <w:p>
-      <w:pPr>
-        <w:ind w:firstLine="0"/>
-        <w:jc w:val="center"/>
-      </w:pPr>
-    </w:p>
-    <w:p>
-      <w:pPr>
-        <w:ind w:firstLine="0"/>
-        <w:rPr>
-          <w:b/>
-          <w:bCs/>
-        </w:rPr>
-      </w:pPr>
-      <w:r>
-        <w:rPr>
-          <w:b/>
-          <w:bCs/>
-        </w:rPr>
-        <w:t>III – CONSEQUÊNCIA JURÍDICA NECESSÁRIA</w:t>
-      </w:r>
-    </w:p>
-    <w:p>
-      <w:pPr>
-        <w:ind w:firstLine="0"/>
-      </w:pPr>
-      <w:r>
-        <w:tab/>
-      </w:r>
-      <w:r>
-        <w:t xml:space="preserve">Diante da orientação obrigatória do STJ, a manutenção do feito representaria violação direta aos </w:t>
-      </w:r>
-      <w:proofErr w:type="spellStart"/>
-      <w:r>
-        <w:t>arts</w:t>
-      </w:r>
-      <w:proofErr w:type="spellEnd"/>
-      <w:r>
-        <w:t>. 927, III, e 489, §1º, VI, do CPC, além de afronta à segurança jurídica e à isonomia.</w:t>
-      </w:r>
-    </w:p>
-    <w:p>
-      <w:pPr>
-        <w:ind w:firstLine="0"/>
-        <w:rPr>
-          <w:b/>
-          <w:bCs/>
-        </w:rPr>
-      </w:pPr>
-      <w:r>
-        <w:rPr>
-          <w:b/>
-          <w:bCs/>
-        </w:rPr>
-        <w:t>IV – DOS HONORÁRIOS ADVOCATÍCIOS DE SUCUMBÊNCIA</w:t>
-      </w:r>
-    </w:p>
-    <w:p>
-      <w:pPr>
-        <w:rPr>
-          <w:shd w:val="clear" w:color="auto" w:fill="FFFF00"/>
-        </w:rPr>
-      </w:pPr>
-      <w:r>
-        <w:t>Reconhecida a prescrição da pretensão autoral, com a consequente extinção do processo com resolução do mérito, impõe-se a condenação da parte autora ao pagamento de honorários advocatícios sucumbenciais, nos termos do art. 85, caput e §2º, do Código de Processo Civil.</w:t>
-      </w:r>
-      <w:r>
-        <w:t xml:space="preserve"> </w:t>
-      </w:r>
-      <w:r>
-        <w:rPr>
-          <w:shd w:val="clear" w:color="auto" w:fill="FFFF00"/>
-        </w:rPr>
-        <w:t>Conforme se observa nos autos, a parte autora é Servidor Público aposentado, conforme contracheque/comprovante:</w:t>
-      </w:r>
-    </w:p>
-    <w:p>
-      <w:pPr>
-        <w:rPr>
-          <w:shd w:val="clear" w:color="auto" w:fill="FFFF00"/>
-        </w:rPr>
-      </w:pPr>
-    </w:p>
-    <w:p>
-      <w:pPr>
-        <w:jc w:val="center"/>
-        <w:rPr>
-          <w:shd w:val="clear" w:color="auto" w:fill="FFFF00"/>
-        </w:rPr>
-      </w:pPr>
-      <w:r>
-        <w:rPr>
-          <w:shd w:val="clear" w:color="auto" w:fill="FFFF00"/>
-        </w:rPr>
-        <w:t>Inserir comprovante</w:t>
-      </w:r>
-    </w:p>
-    <w:p/>
+        <w:t>Conforme se abstrai da própria natureza da ação, o autor é servidor público aposentado.</w:t>
+      </w:r>
+    </w:p>
     <w:p>
       <w:r>
         <w:t>A demanda foi ajuizada em frontal desconformidade com a orientação firmada pelo Superior Tribunal de Justiça em sede de recurso repetitivo (Tema 1.387), circunstância que reforça a necessidade de adequada fixação da verba honorária, inclusive como medida de desestímulo à litigância contrária à jurisprudência vinculante.</w:t>
@@ -430,15 +415,7 @@
         </w:numPr>
       </w:pPr>
       <w:r>
-        <w:t xml:space="preserve">O julgamento antecipado do mérito, nos termos do art. 355, i, do </w:t>
-      </w:r>
-      <w:proofErr w:type="spellStart"/>
-      <w:r>
-        <w:t>cpc</w:t>
-      </w:r>
-      <w:proofErr w:type="spellEnd"/>
-      <w:r>
-        <w:t>;</w:t>
+        <w:t>O julgamento antecipado do mérito, nos termos do art. 355, i, do cpc;</w:t>
       </w:r>
       <w:r>
         <w:tab/>
@@ -453,23 +430,7 @@
         </w:numPr>
       </w:pPr>
       <w:r>
-        <w:t xml:space="preserve">O reconhecimento da prescrição, com a consequente extinção do processo com resolução do mérito (art. 487, </w:t>
-      </w:r>
-      <w:proofErr w:type="spellStart"/>
-      <w:r>
-        <w:t>ii</w:t>
-      </w:r>
-      <w:proofErr w:type="spellEnd"/>
-      <w:r>
-        <w:t xml:space="preserve">, do </w:t>
-      </w:r>
-      <w:proofErr w:type="spellStart"/>
-      <w:r>
-        <w:t>cpc</w:t>
-      </w:r>
-      <w:proofErr w:type="spellEnd"/>
-      <w:r>
-        <w:t>);</w:t>
+        <w:t>O reconhecimento da prescrição, com a consequente extinção do processo com resolução do mérito (art. 487, ii, do cpc);</w:t>
       </w:r>
       <w:r>
         <w:tab/>
@@ -484,7 +445,6 @@
         </w:numPr>
       </w:pPr>
       <w:r>
-        <w:lastRenderedPageBreak/>
         <w:t>A condenação da parte autora ao pagamento das verbas de sucumbência.</w:t>
       </w:r>
     </w:p>
@@ -508,79 +468,65 @@
           <w:i/>
           <w:iCs/>
         </w:rPr>
-        <w:t>Termos em que,</w:t>
-      </w:r>
-      <w:r>
+        <w:t>Termos em que, pede deferimento.</w:t>
+      </w:r>
+    </w:p>
+    <w:p>
+      <w:pPr>
+        <w:ind w:firstLine="0"/>
+        <w:jc w:val="left"/>
         <w:rPr>
           <w:i/>
           <w:iCs/>
         </w:rPr>
-        <w:t xml:space="preserve"> p</w:t>
-      </w:r>
+      </w:pPr>
       <w:r>
         <w:rPr>
           <w:i/>
           <w:iCs/>
         </w:rPr>
-        <w:t>ede deferimento.</w:t>
-      </w:r>
-    </w:p>
-    <w:p>
-      <w:pPr>
-        <w:ind w:firstLine="0"/>
-        <w:jc w:val="left"/>
+        <w:t>Natal RN, em</w:t>
+      </w:r>
+      <w:r>
         <w:rPr>
           <w:i/>
           <w:iCs/>
         </w:rPr>
-      </w:pPr>
-      <w:r>
+        <w:t xml:space="preserve"> {{ data_de_hoje }} </w:t>
+      </w:r>
+    </w:p>
+    <w:p>
+      <w:pPr>
+        <w:ind w:firstLine="0"/>
+      </w:pPr>
+    </w:p>
+    <w:p>
+      <w:pPr>
+        <w:spacing w:after="0"/>
+        <w:ind w:firstLine="0"/>
+        <w:jc w:val="center"/>
+        <w:rPr>
+          <w:b/>
+          <w:bCs/>
+        </w:rPr>
+      </w:pPr>
+      <w:r>
+        <w:rPr>
+          <w:b/>
+          <w:bCs/>
+        </w:rPr>
+        <w:t>MARCOS DELLI RIBEIRO RODRIGUES</w:t>
+      </w:r>
+    </w:p>
+    <w:p>
+      <w:pPr>
+        <w:spacing w:after="0"/>
+        <w:ind w:firstLine="0"/>
+        <w:jc w:val="center"/>
         <w:rPr>
           <w:i/>
           <w:iCs/>
-        </w:rPr>
-        <w:t xml:space="preserve">Natal RN, em </w:t>
-      </w:r>
-      <w:r>
-        <w:rPr>
-          <w:i/>
-          <w:iCs/>
-          <w:shd w:val="clear" w:color="auto" w:fill="FFFF00"/>
-        </w:rPr>
-        <w:t>27 de janeiro de 2025</w:t>
-      </w:r>
-    </w:p>
-    <w:p>
-      <w:pPr>
-        <w:ind w:firstLine="0"/>
-      </w:pPr>
-    </w:p>
-    <w:p>
-      <w:pPr>
-        <w:spacing w:after="0"/>
-        <w:ind w:firstLine="0"/>
-        <w:jc w:val="center"/>
-        <w:rPr>
-          <w:b/>
-          <w:bCs/>
-        </w:rPr>
-      </w:pPr>
-      <w:r>
-        <w:rPr>
-          <w:b/>
-          <w:bCs/>
-        </w:rPr>
-        <w:t>MARCOS DELLI RIBEIRO RODRIGUES</w:t>
-      </w:r>
-    </w:p>
-    <w:p>
-      <w:pPr>
-        <w:spacing w:after="0"/>
-        <w:ind w:firstLine="0"/>
-        <w:jc w:val="center"/>
-        <w:rPr>
-          <w:i/>
-          <w:iCs/>
+          <w:u w:val="single"/>
         </w:rPr>
       </w:pPr>
       <w:r>
@@ -1902,6 +1848,7 @@
   <w:style w:type="character" w:default="1" w:styleId="Fontepargpadro">
     <w:name w:val="Default Paragraph Font"/>
     <w:uiPriority w:val="1"/>
+    <w:semiHidden/>
     <w:unhideWhenUsed/>
   </w:style>
   <w:style w:type="table" w:default="1" w:styleId="Tabelanormal">

</xml_diff>